<commit_message>
Added reports localizer's files
</commit_message>
<xml_diff>
--- a/FinanceManager/FinanceManager.Web/wwwroot/reports/report-6fb97574-8dd8-4c84-69fa-08dda8abb382.docx
+++ b/FinanceManager/FinanceManager.Web/wwwroot/reports/report-6fb97574-8dd8-4c84-69fa-08dda8abb382.docx
@@ -55,7 +55,7 @@
         <w:rPr>
           <w:sz w:val="28"/>
         </w:rPr>
-        <w:t>Period: 01.01.2025 - 22.06.2025</w:t>
+        <w:t>Period: 01.01.2025 - 23.06.2025</w:t>
       </w:r>
     </w:p>
     <w:p>
@@ -532,7 +532,7 @@
             <wp:cNvGraphicFramePr/>
             <a:graphic xmlns:a="http://schemas.openxmlformats.org/drawingml/2006/main">
               <a:graphicData uri="http://schemas.openxmlformats.org/drawingml/2006/chart">
-                <c:chart xmlns:r="http://schemas.openxmlformats.org/officeDocument/2006/relationships" xmlns:c="http://schemas.openxmlformats.org/drawingml/2006/chart" r:id="R2ffa16ce99324aeb"/>
+                <c:chart xmlns:r="http://schemas.openxmlformats.org/officeDocument/2006/relationships" xmlns:c="http://schemas.openxmlformats.org/drawingml/2006/chart" r:id="R9d8bd97563eb4d78"/>
               </a:graphicData>
             </a:graphic>
           </wp:inline>

</xml_diff>

<commit_message>
Swapped tokenservice and cqrs token requests
</commit_message>
<xml_diff>
--- a/FinanceManager/FinanceManager.Web/wwwroot/reports/report-6fb97574-8dd8-4c84-69fa-08dda8abb382.docx
+++ b/FinanceManager/FinanceManager.Web/wwwroot/reports/report-6fb97574-8dd8-4c84-69fa-08dda8abb382.docx
@@ -55,7 +55,7 @@
         <w:rPr>
           <w:sz w:val="28"/>
         </w:rPr>
-        <w:t>Період:01.01.2025 - 24.06.2025</w:t>
+        <w:t>Період:01.01.2025 - 21.07.2025</w:t>
       </w:r>
     </w:p>
     <w:p>
@@ -532,7 +532,7 @@
             <wp:cNvGraphicFramePr/>
             <a:graphic xmlns:a="http://schemas.openxmlformats.org/drawingml/2006/main">
               <a:graphicData uri="http://schemas.openxmlformats.org/drawingml/2006/chart">
-                <c:chart xmlns:r="http://schemas.openxmlformats.org/officeDocument/2006/relationships" xmlns:c="http://schemas.openxmlformats.org/drawingml/2006/chart" r:id="Ra0af75e051bc4d94"/>
+                <c:chart xmlns:r="http://schemas.openxmlformats.org/officeDocument/2006/relationships" xmlns:c="http://schemas.openxmlformats.org/drawingml/2006/chart" r:id="R3b99f016e3b8443d"/>
               </a:graphicData>
             </a:graphic>
           </wp:inline>

</xml_diff>